<commit_message>
Marca las corridas de prueba para que no se mezclen con los experimentos
Una corrida de banco y una con animales se veian identicas en el monitor:
nada en la telemetria decia cual era cual, y el historico mezclaba datos de
prueba con datos cientificos sin aviso.

La tarjeta SD declara ahora runType ("normal" | "test"). No apaga ninguna
proteccion -- cada relajacion sigue en su propia seccion --, solo marca: la
placa manda TEST siempre (true o false) en targets y result, y en modo
prueba muestra una franja MODO PRUEBA y un aviso de arranque en la capa
superior de LVGL, que sobrevive a la destruccion de pantallas.

El monitor guarda runType por corrida (normal / test / unknown) y no lista
las pruebas salvo que se pidan. Sin marca es unknown y no normal: un
firmware viejo no dice si hubo animales. El simulador publica TEST: true
por defecto, porque sus datos son inventados.

Co-Authored-By: Claude Opus 5.5 <noreply@anthropic.com>
</commit_message>
<xml_diff>
--- a/docs/manual-de-usuario.docx
+++ b/docs/manual-de-usuario.docx
@@ -6590,7 +6590,46 @@
     </w:p>
     <w:p>
       <w:r>
-        <w:t xml:space="preserve">Lista los experimentos registrados, del más reciente al más antiguo, con su fecha, su modo de exposición, cómo terminó y cuántas alertas registró. Puede filtrarse por modo y por motivo de finalización.</w:t>
+        <w:t xml:space="preserve">Lista los experimentos registrados, del más reciente al más antiguo, con su fecha, su modo de exposición, cómo terminó y cuántas alertas registró. Puede filtrarse por modo, por motivo de finalización y por tipo de corrida.</w:t>
+      </w:r>
+    </w:p>
+    <w:p>
+      <w:r>
+        <w:rPr>
+          <w:b/>
+        </w:rPr>
+        <w:t xml:space="preserve">Las corridas de prueba no se listan por defecto.</w:t>
+      </w:r>
+      <w:r>
+        <w:t xml:space="preserve"> Son las hechas con una tarjeta que declara </w:t>
+      </w:r>
+      <w:r>
+        <w:rPr>
+          <w:rFonts w:ascii="Consolas" w:hAnsi="Consolas"/>
+          <w:sz w:val="19"/>
+        </w:rPr>
+        <w:t xml:space="preserve">runType: "test"</w:t>
+      </w:r>
+      <w:r>
+        <w:t xml:space="preserve"> (ver la sección 14) y llevan el distintivo </w:t>
+      </w:r>
+      <w:r>
+        <w:rPr>
+          <w:b/>
+        </w:rPr>
+        <w:t xml:space="preserve">PRUEBA</w:t>
+      </w:r>
+      <w:r>
+        <w:t xml:space="preserve">. Para verlas se elige «Solo pruebas» o «Todas» en el filtro de tipo. Una corrida con el distintivo </w:t>
+      </w:r>
+      <w:r>
+        <w:rPr>
+          <w:b/>
+        </w:rPr>
+        <w:t xml:space="preserve">SIN MARCA</w:t>
+      </w:r>
+      <w:r>
+        <w:t xml:space="preserve"> proviene de un firmware anterior a esta marca: no se sabe si fue un experimento o una prueba, y por eso no se la presenta como ninguno de los dos.</w:t>
       </w:r>
     </w:p>
     <w:p>
@@ -6815,6 +6854,131 @@
       </w:r>
       <w:r>
         <w:t xml:space="preserve"> Modificar el archivo con el equipo en marcha no tiene efecto: es necesario reiniciar la interfaz.</w:t>
+      </w:r>
+    </w:p>
+    <w:p>
+      <w:pPr>
+        <w:pStyle w:val="Heading2"/>
+      </w:pPr>
+      <w:r>
+        <w:t xml:space="preserve">Corridas de prueba</w:t>
+      </w:r>
+    </w:p>
+    <w:p>
+      <w:r>
+        <w:t xml:space="preserve">El archivo declara si lo que se corra con esa tarjeta es un </w:t>
+      </w:r>
+      <w:r>
+        <w:rPr>
+          <w:b/>
+        </w:rPr>
+        <w:t xml:space="preserve">experimento</w:t>
+      </w:r>
+      <w:r>
+        <w:t xml:space="preserve"> o una </w:t>
+      </w:r>
+      <w:r>
+        <w:rPr>
+          <w:b/>
+        </w:rPr>
+        <w:t xml:space="preserve">prueba de banco</w:t>
+      </w:r>
+      <w:r>
+        <w:t xml:space="preserve"> (clave </w:t>
+      </w:r>
+      <w:r>
+        <w:rPr>
+          <w:rFonts w:ascii="Consolas" w:hAnsi="Consolas"/>
+          <w:sz w:val="19"/>
+        </w:rPr>
+        <w:t xml:space="preserve">runType</w:t>
+      </w:r>
+      <w:r>
+        <w:t xml:space="preserve">, «Tipo de corrida» en el generador). El valor de fábrica, y el que rige sin tarjeta, es experimento.</w:t>
+      </w:r>
+    </w:p>
+    <w:p>
+      <w:r>
+        <w:t xml:space="preserve">Con una tarjeta de prueba la pantalla lo hace evidente de dos maneras: al encender aparece un cartel </w:t>
+      </w:r>
+      <w:r>
+        <w:rPr>
+          <w:b/>
+        </w:rPr>
+        <w:t xml:space="preserve">«Configuración de prueba»</w:t>
+      </w:r>
+      <w:r>
+        <w:t xml:space="preserve"> que hay que cerrar con </w:t>
+      </w:r>
+      <w:r>
+        <w:rPr>
+          <w:b/>
+        </w:rPr>
+        <w:t xml:space="preserve">ENTENDIDO</w:t>
+      </w:r>
+      <w:r>
+        <w:t xml:space="preserve"> antes de poder operar, y durante todo el uso queda una franja </w:t>
+      </w:r>
+      <w:r>
+        <w:rPr>
+          <w:b/>
+        </w:rPr>
+        <w:t xml:space="preserve">MODO PRUEBA</w:t>
+      </w:r>
+      <w:r>
+        <w:t xml:space="preserve"> en el borde superior. Las corridas se publican marcadas, y el monitor web las separa de los experimentos.</w:t>
+      </w:r>
+    </w:p>
+    <w:p>
+      <w:pPr>
+        <w:pStyle w:val="Etiqueta"/>
+        <w:pBdr>
+          <w:left w:val="single" w:sz="18" w:space="8" w:color="6D4100"/>
+        </w:pBdr>
+        <w:shd w:val="clear" w:fill="FBF4E6"/>
+        <w:ind w:left="200" w:right="120"/>
+        <w:spacing w:before="180" w:after="40"/>
+      </w:pPr>
+      <w:r>
+        <w:t xml:space="preserve">Qué hace y qué no hace</w:t>
+      </w:r>
+    </w:p>
+    <w:p>
+      <w:pPr>
+        <w:pStyle w:val="Llamada"/>
+        <w:pBdr>
+          <w:left w:val="single" w:sz="18" w:space="8" w:color="6D4100"/>
+        </w:pBdr>
+        <w:shd w:val="clear" w:fill="FBF4E6"/>
+        <w:ind w:left="200" w:right="120"/>
+      </w:pPr>
+      <w:r>
+        <w:rPr>
+          <w:b/>
+        </w:rPr>
+        <w:t xml:space="preserve">Declarar una prueba no apaga ninguna protección.</w:t>
+      </w:r>
+      <w:r>
+        <w:t xml:space="preserve"> Solo marca las corridas. Si en una prueba se quiere, por ejemplo, desactivar una fuente del detector, eso se configura aparte, en su propia sección del archivo. A la inversa, una tarjeta declarada como experimento puede tener protecciones desactivadas: antes de un experimento real conviene revisar el archivo completo, no solo el tipo de corrida.</w:t>
+      </w:r>
+    </w:p>
+    <w:p>
+      <w:pPr>
+        <w:pStyle w:val="Llamada"/>
+        <w:pBdr>
+          <w:left w:val="single" w:sz="18" w:space="8" w:color="6D4100"/>
+        </w:pBdr>
+        <w:shd w:val="clear" w:fill="FBF4E6"/>
+        <w:ind w:left="200" w:right="120"/>
+      </w:pPr>
+      <w:r>
+        <w:rPr>
+          <w:b/>
+        </w:rPr>
+        <w:t xml:space="preserve">La parada de emergencia no puede desactivarse</w:t>
+      </w:r>
+      <w:r>
+        <w:t xml:space="preserve"> desde la configuración, en ningún tipo de corrida.</w:t>
       </w:r>
     </w:p>
     <w:p>

</xml_diff>

<commit_message>
Corta el experimento cuando un sensor vigilado deja de dar lecturas
El Detector solo evaluaba las muestras que llegaban: un DS18B20
desconectado a mitad de corrida dejaba a los animales expuestos sin control
de temperatura y la corrida terminaba como completed. Lo mostro el perfil
"sensor caido" de los escenarios sinteticos.

Ahora una fuente vigilada que pierde maxMissedSamples lecturas seguidas
(default 3, piso de 5 s por el bloqueo del DS18B20) corta con una alerta
"silence" por la misma via que un limite critico. El reloj corre desde el
start y el corte se habilita al terminar la estabilizacion.

CEM1 caido con el lazo activo corta siempre, vigilado o no y aun con el
detector apagado: sin el magnetometro, el lazo seguiria excitando las
bobinas con el ultimo duty, a ciegas. Por eso TEMP1 vigilada sin sensor
pasa a ser un error en el generador.

Co-Authored-By: Claude Opus 5.5 <noreply@anthropic.com>
</commit_message>
<xml_diff>
--- a/docs/manual-de-usuario.docx
+++ b/docs/manual-de-usuario.docx
@@ -7390,6 +7390,42 @@
       </w:r>
       <w:r>
         <w:t xml:space="preserve">, aunque la tarjeta declare corridas normales.</w:t>
+      </w:r>
+    </w:p>
+    <w:p>
+      <w:pPr>
+        <w:pStyle w:val="Heading2"/>
+      </w:pPr>
+      <w:r>
+        <w:t xml:space="preserve">Sensor sin lecturas</w:t>
+      </w:r>
+    </w:p>
+    <w:p>
+      <w:r>
+        <w:t xml:space="preserve">Si un sensor vigilado deja de dar lecturas durante un experimento —se desconecta, se daña o falla su comunicación—, el equipo </w:t>
+      </w:r>
+      <w:r>
+        <w:rPr>
+          <w:b/>
+        </w:rPr>
+        <w:t xml:space="preserve">corta el experimento</w:t>
+      </w:r>
+      <w:r>
+        <w:t xml:space="preserve"> y la pantalla de resultado indica, por ejemplo, «TEMP1 SIN LECTURAS». De fábrica, el termómetro puede perder tres lecturas seguidas (15 segundos) antes del corte.</w:t>
+      </w:r>
+    </w:p>
+    <w:p>
+      <w:r>
+        <w:t xml:space="preserve">El magnetómetro tiene una regla adicional: mientras el equipo regula la intensidad del campo, </w:t>
+      </w:r>
+      <w:r>
+        <w:rPr>
+          <w:b/>
+        </w:rPr>
+        <w:t xml:space="preserve">su falta de lecturas siempre corta</w:t>
+      </w:r>
+      <w:r>
+        <w:t xml:space="preserve">, aunque no esté vigilado, porque sin él las bobinas quedarían excitadas sin control. Si el magnetómetro no está conectado, todo experimento con regulación activa se cortará a los pocos segundos de iniciado.</w:t>
       </w:r>
     </w:p>
     <w:p>

</xml_diff>

<commit_message>
Registra con que configuracion y que relajaciones corrio cada experimento
Para la trazabilidad cientifica hace falta poder decir, de cada corrida
guardada, con que umbrales, factores y ganancias corrio. Y como cada
parametro es configurable por separado, un experimento declarado normal
podia tener protecciones apagadas sin que nada lo registrara.

La placa publica en targets un id de configuracion (CRC32 del JSON leido
sin wifi ni broker, o "default") y una mascara de relajaciones. El id lo
calcula solo la placa: el monitor lo guarda y no lo recalcula, asi no hay
dos implementaciones del mismo hash que puedan divergir.

El monitor guarda las dos cosas y marca CON RELAJACIONES a un experimento
normal que tuvo alguna. CEM1 sin vigilar se registra pero no avisa: es el
default de fabrica y marcaria a todos.

Co-Authored-By: Claude Opus 5.5 <noreply@anthropic.com>
</commit_message>
<xml_diff>
--- a/docs/manual-de-usuario.docx
+++ b/docs/manual-de-usuario.docx
@@ -6647,6 +6647,20 @@
       </w:r>
     </w:p>
     <w:p>
+      <w:r>
+        <w:t xml:space="preserve">Un experimento puede llevar el distintivo </w:t>
+      </w:r>
+      <w:r>
+        <w:rPr>
+          <w:b/>
+        </w:rPr>
+        <w:t xml:space="preserve">CON RELAJACIONES</w:t>
+      </w:r>
+      <w:r>
+        <w:t xml:space="preserve">: se declaró como experimento, pero corrió con alguna protección apagada (el detector, la vigilancia de la temperatura, el control de intensidad) o con sensores simulados. Sus mediciones pueden ser reales, pero no son las de un experimento en condiciones.</w:t>
+      </w:r>
+    </w:p>
+    <w:p>
       <w:pPr>
         <w:pStyle w:val="Heading2"/>
       </w:pPr>
@@ -6657,6 +6671,20 @@
     <w:p>
       <w:r>
         <w:t xml:space="preserve">Al abrir un experimento se accede a sus consignas, su resultado y los gráficos de campo, temperatura, corriente y ciclo de trabajo por bobina. Sobre las mediciones, líneas verticales punteadas señalan el momento de cada alerta.</w:t>
+      </w:r>
+    </w:p>
+    <w:p>
+      <w:r>
+        <w:t xml:space="preserve">El detalle indica también con qué </w:t>
+      </w:r>
+      <w:r>
+        <w:rPr>
+          <w:b/>
+        </w:rPr>
+        <w:t xml:space="preserve">configuración</w:t>
+      </w:r>
+      <w:r>
+        <w:t xml:space="preserve"> corrió el experimento: un código que identifica el archivo de la tarjeta SD («default» si se usaron los valores de fábrica), y la lista de relajaciones que tenía activas. Dos experimentos con el mismo código corrieron con exactamente los mismos umbrales, factores y ganancias.</w:t>
       </w:r>
     </w:p>
     <w:p>

</xml_diff>

<commit_message>
Permite editar la configuracion desde el monitor web y grabarla en la SD de la placa
Hasta ahora cambiar un valor obligaba a sacar la tarjeta, editar el JSON y
volver a meterla. La placa publica su configuracion vigente (sin wifi ni
broker) en bloques retenidos y recibe la nueva de a un bloque por vez, con
ack por bloque y reintentos, porque un mensaje MQTT entero no entra en el
buffer. Antes de reemplazar la vigente la valida, la respalda en
config.prev.json y restituye sus propias credenciales; se rechaza mientras
hay un experimento en curso y se aplica en el proximo reinicio.

El monitor embebe el generador de tools/ para tener una sola fuente de
validacion, con un test que impide que la copia se desincronice. De paso:
"Cargar archivo" del generador borraba wifi y broker en silencio, la placa
truncaba todo mensaje MQTT entrante a 128 bytes y produccion prohibia hasta
el iframe del propio monitor.

Co-Authored-By: Claude Code <noreply@anthropic.com>
</commit_message>
<xml_diff>
--- a/docs/manual-de-usuario.docx
+++ b/docs/manual-de-usuario.docx
@@ -6761,10 +6761,10 @@
         <w:rPr>
           <w:b/>
         </w:rPr>
-        <w:t xml:space="preserve">Es de solo lectura, por diseño.</w:t>
-      </w:r>
-      <w:r>
-        <w:t xml:space="preserve"> No es posible iniciar ni detener un experimento desde la web, ni lo será: hacerlo energizaría las bobinas con animales en el gabinete y sin nadie en la sala, mientras que la parada de emergencia solo auxilia a quien ya está presente.</w:t>
+        <w:t xml:space="preserve">No controla el experimento, por diseño.</w:t>
+      </w:r>
+      <w:r>
+        <w:t xml:space="preserve"> No es posible iniciar ni detener un experimento desde la web, ni lo será: hacerlo energizaría las bobinas con animales en el gabinete y sin nadie en la sala, mientras que la parada de emergencia solo auxilia a quien ya está presente. Lo único que la web puede cambiar es la configuración (ver abajo).</w:t>
       </w:r>
     </w:p>
     <w:p>
@@ -6803,6 +6803,67 @@
       </w:r>
       <w:r>
         <w:t xml:space="preserve"> Es el único que escucha al equipo; lo publicado mientras está detenido se pierde y no se recupera. Aparece luego como un tramo sin mediciones.</w:t>
+      </w:r>
+    </w:p>
+    <w:p>
+      <w:pPr>
+        <w:pStyle w:val="Heading2"/>
+      </w:pPr>
+      <w:r>
+        <w:t xml:space="preserve">Pantalla «Configuración»</w:t>
+      </w:r>
+    </w:p>
+    <w:p>
+      <w:r>
+        <w:t xml:space="preserve">Muestra con qué configuración está funcionando la placa y permite enviarle una nueva. El formulario es el mismo generador de configuración que acompaña al equipo, con las mismas validaciones: no deja enviar un archivo con errores. La red WiFi y el broker no se editan desde acá y la placa conserva los suyos.</w:t>
+      </w:r>
+    </w:p>
+    <w:p>
+      <w:r>
+        <w:t xml:space="preserve">Al enviar, la placa recibe la configuración, la valida y la graba en su tarjeta SD, dejando la anterior respaldada como </w:t>
+      </w:r>
+      <w:r>
+        <w:rPr>
+          <w:rFonts w:ascii="Consolas" w:hAnsi="Consolas"/>
+          <w:sz w:val="19"/>
+        </w:rPr>
+        <w:t xml:space="preserve">config.prev.json</w:t>
+      </w:r>
+      <w:r>
+        <w:t xml:space="preserve">. La pantalla informa el resultado: «Grabada en la placa», o el motivo del rechazo (por ejemplo, un experimento en curso).</w:t>
+      </w:r>
+    </w:p>
+    <w:p>
+      <w:pPr>
+        <w:pStyle w:val="Etiqueta"/>
+        <w:pBdr>
+          <w:left w:val="single" w:sz="18" w:space="8" w:color="6D4100"/>
+        </w:pBdr>
+        <w:shd w:val="clear" w:fill="FBF4E6"/>
+        <w:ind w:left="200" w:right="120"/>
+        <w:spacing w:before="180" w:after="40"/>
+      </w:pPr>
+      <w:r>
+        <w:t xml:space="preserve">Cuándo se aplica</w:t>
+      </w:r>
+    </w:p>
+    <w:p>
+      <w:pPr>
+        <w:pStyle w:val="Llamada"/>
+        <w:pBdr>
+          <w:left w:val="single" w:sz="18" w:space="8" w:color="6D4100"/>
+        </w:pBdr>
+        <w:shd w:val="clear" w:fill="FBF4E6"/>
+        <w:ind w:left="200" w:right="120"/>
+      </w:pPr>
+      <w:r>
+        <w:rPr>
+          <w:b/>
+        </w:rPr>
+        <w:t xml:space="preserve">La configuración enviada se aplica en el próximo reinicio de la placa</w:t>
+      </w:r>
+      <w:r>
+        <w:t xml:space="preserve">, cualquiera sea su causa, y la placa no pide confirmación en su pantalla. Para aplicarla de inmediato hay que reiniciarla a mano. Un envío se rechaza mientras hay un experimento en curso.</w:t>
       </w:r>
     </w:p>
     <w:p>

</xml_diff>

<commit_message>
Mide el campo como valor eficaz (RMS) y elimina la tara del ambiente
Una lectura instantanea dependia de donde caia en la senal de 1 a 100 Hz, y el
ambiente (continuo) podia ocupar toda la banda de tolerancia. El Mega ahora
ajusta a*cos+b*sen+c por grupos de 10 muestras con su hora real: el termino
constante es el ambiente y queda fuera, asi que la tara y control.tare sobran.
A frecuencias altas las muestras se espacian con la razon aurea sobre varios
periodos, porque con 3 por periodo el 2do armonico caia sobre la fundamental.

La medicion no bloquea (una transaccion I2C por vuelta), el DS18B20 pasa a
asincrono, Wire tiene timeout y la ventana del SCT013 se corta con el boton de
emergencia: lo negociable fue la cadencia (2 s) y el asentamiento; la latencia
del paro y la precision del campo no.

Co-Authored-By: Claude Code <noreply@anthropic.com>
</commit_message>
<xml_diff>
--- a/docs/manual-de-usuario.docx
+++ b/docs/manual-de-usuario.docx
@@ -84,7 +84,7 @@
         <w:t xml:space="preserve">BioSoft se encuentra en desarrollo.</w:t>
       </w:r>
       <w:r>
-        <w:t xml:space="preserve"> La sección 14 enumera los aspectos que aún no están calibrados, montados o accesibles desde la interfaz. Su lectura es obligatoria antes de emplear el equipo con animales, puesto que condiciona qué diseños experimentales son válidos en el estado actual.</w:t>
+        <w:t xml:space="preserve"> La sección 15 enumera los aspectos que aún no están calibrados, montados o accesibles desde la interfaz. Su lectura es obligatoria antes de emplear el equipo con animales, puesto que condiciona qué diseños experimentales son válidos en el estado actual.</w:t>
       </w:r>
     </w:p>
     <w:p>
@@ -5178,7 +5178,7 @@
               <w:pStyle w:val="TablaCelda"/>
             </w:pPr>
             <w:r>
-              <w:t xml:space="preserve">Al finalizar un experimento, cualquiera sea el motivo.</w:t>
+              <w:t xml:space="preserve">Al finalizar un experimento, cualquiera sea el motivo, y también cuando el equipo se niega a iniciarlo (sección 8).</w:t>
             </w:r>
           </w:p>
         </w:tc>
@@ -5213,7 +5213,25 @@
     </w:p>
     <w:p>
       <w:r>
-        <w:t xml:space="preserve">Presenta los seis parámetros con los que se ejecutará el próximo experimento y dos botones: </w:t>
+        <w:t xml:space="preserve">Presenta los seis parámetros con los que se ejecutará el próximo experimento, el modo de exposición (</w:t>
+      </w:r>
+      <w:r>
+        <w:rPr>
+          <w:b/>
+        </w:rPr>
+        <w:t xml:space="preserve">campo X</w:t>
+      </w:r>
+      <w:r>
+        <w:t xml:space="preserve"> o </w:t>
+      </w:r>
+      <w:r>
+        <w:rPr>
+          <w:b/>
+        </w:rPr>
+        <w:t xml:space="preserve">campo nulo</w:t>
+      </w:r>
+      <w:r>
+        <w:t xml:space="preserve">) y dos botones: </w:t>
       </w:r>
       <w:r>
         <w:rPr>
@@ -5253,7 +5271,7 @@
         <w:t xml:space="preserve">Configuración</w:t>
       </w:r>
       <w:r>
-        <w:t xml:space="preserve"> ofrece seis listas desplegables. </w:t>
+        <w:t xml:space="preserve"> ofrece siete listas desplegables. </w:t>
       </w:r>
       <w:r>
         <w:rPr>
@@ -5508,11 +5526,156 @@
           </w:p>
         </w:tc>
       </w:tr>
+      <w:tr>
+        <w:tc>
+          <w:tcPr>
+            <w:tcW w:w="4680" w:type="dxa"/>
+          </w:tcPr>
+          <w:p>
+            <w:pPr>
+              <w:pStyle w:val="TablaCelda"/>
+            </w:pPr>
+            <w:r>
+              <w:rPr>
+                <w:b/>
+              </w:rPr>
+              <w:t xml:space="preserve">Modo de exposición</w:t>
+            </w:r>
+          </w:p>
+        </w:tc>
+        <w:tc>
+          <w:tcPr>
+            <w:tcW w:w="4680" w:type="dxa"/>
+          </w:tcPr>
+          <w:p>
+            <w:pPr>
+              <w:pStyle w:val="TablaCelda"/>
+            </w:pPr>
+            <w:r>
+              <w:rPr>
+                <w:b/>
+              </w:rPr>
+              <w:t xml:space="preserve">Campo X</w:t>
+            </w:r>
+            <w:r>
+              <w:t xml:space="preserve"> (condición de exposición) o </w:t>
+            </w:r>
+            <w:r>
+              <w:rPr>
+                <w:b/>
+              </w:rPr>
+              <w:t xml:space="preserve">campo nulo</w:t>
+            </w:r>
+            <w:r>
+              <w:t xml:space="preserve"> (grupo control). Ver más abajo.</w:t>
+            </w:r>
+          </w:p>
+        </w:tc>
+      </w:tr>
     </w:tbl>
     <w:p>
       <w:pPr>
         <w:spacing w:after="0" w:line="120" w:lineRule="exact"/>
       </w:pPr>
+    </w:p>
+    <w:p>
+      <w:pPr>
+        <w:pStyle w:val="Heading2"/>
+      </w:pPr>
+      <w:r>
+        <w:t xml:space="preserve">El modo de exposición</w:t>
+      </w:r>
+    </w:p>
+    <w:p>
+      <w:r>
+        <w:t xml:space="preserve">La lista ofrece exactamente dos entradas, campo X y campo nulo, y </w:t>
+      </w:r>
+      <w:r>
+        <w:rPr>
+          <w:b/>
+        </w:rPr>
+        <w:t xml:space="preserve">no puede modificarse desde la tarjeta SD</w:t>
+      </w:r>
+      <w:r>
+        <w:t xml:space="preserve">: son la condición experimental, no un valor que el operador calibre. El valor inicial es siempre </w:t>
+      </w:r>
+      <w:r>
+        <w:rPr>
+          <w:b/>
+        </w:rPr>
+        <w:t xml:space="preserve">campo X</w:t>
+      </w:r>
+      <w:r>
+        <w:t xml:space="preserve">; un campo nulo accidental sería indistinguible de un experimento normal. El modo se elige antes de iniciar y </w:t>
+      </w:r>
+      <w:r>
+        <w:rPr>
+          <w:b/>
+        </w:rPr>
+        <w:t xml:space="preserve">no puede cambiarse con el experimento en curso</w:t>
+      </w:r>
+      <w:r>
+        <w:t xml:space="preserve">.</w:t>
+      </w:r>
+    </w:p>
+    <w:p>
+      <w:r>
+        <w:t xml:space="preserve">En campo nulo el equipo </w:t>
+      </w:r>
+      <w:r>
+        <w:rPr>
+          <w:b/>
+        </w:rPr>
+        <w:t xml:space="preserve">excita las bobinas con la misma corriente</w:t>
+      </w:r>
+      <w:r>
+        <w:t xml:space="preserve"> que usaría para la intensidad elegida, de modo que el ruido, la vibración y el calor sean los mismos que en el grupo tratado, pero la consigna del campo neto es </w:t>
+      </w:r>
+      <w:r>
+        <w:rPr>
+          <w:b/>
+        </w:rPr>
+        <w:t xml:space="preserve">cero</w:t>
+      </w:r>
+      <w:r>
+        <w:t xml:space="preserve">. Como el campo neto es cercano a cero, no hay una lectura contra la cual regular: el equipo aplica el ciclo de trabajo medido previamente en el banco para esa intensidad y esa frecuencia (el «mapa», sección 14) y no lo corrige durante la exposición.</w:t>
+      </w:r>
+    </w:p>
+    <w:p>
+      <w:pPr>
+        <w:pStyle w:val="Etiqueta"/>
+        <w:pBdr>
+          <w:left w:val="single" w:sz="18" w:space="8" w:color="6D4100"/>
+        </w:pBdr>
+        <w:shd w:val="clear" w:fill="FBF4E6"/>
+        <w:ind w:left="200" w:right="120"/>
+        <w:spacing w:before="180" w:after="40"/>
+      </w:pPr>
+      <w:r>
+        <w:t xml:space="preserve">Campo nulo exige mapa</w:t>
+      </w:r>
+    </w:p>
+    <w:p>
+      <w:pPr>
+        <w:pStyle w:val="Llamada"/>
+        <w:pBdr>
+          <w:left w:val="single" w:sz="18" w:space="8" w:color="6D4100"/>
+        </w:pBdr>
+        <w:shd w:val="clear" w:fill="FBF4E6"/>
+        <w:ind w:left="200" w:right="120"/>
+      </w:pPr>
+      <w:r>
+        <w:t xml:space="preserve">Si el mapa no tiene un punto para la intensidad y la frecuencia elegidas, </w:t>
+      </w:r>
+      <w:r>
+        <w:rPr>
+          <w:b/>
+        </w:rPr>
+        <w:t xml:space="preserve">el equipo se niega a iniciar</w:t>
+      </w:r>
+      <w:r>
+        <w:t xml:space="preserve"> en campo nulo y lo informa en la pantalla Resultado (sección 8). No improvisa un valor: un control mal excitado invalidaría la comparación sin dar síntoma alguno.</w:t>
+      </w:r>
     </w:p>
     <w:p>
       <w:pPr>
@@ -5620,6 +5783,29 @@
       </w:r>
     </w:p>
     <w:p>
+      <w:r>
+        <w:t xml:space="preserve">En </w:t>
+      </w:r>
+      <w:r>
+        <w:rPr>
+          <w:b/>
+        </w:rPr>
+        <w:t xml:space="preserve">campo nulo</w:t>
+      </w:r>
+      <w:r>
+        <w:t xml:space="preserve"> la tolerancia sigue siendo un porcentaje de la intensidad elegida, pero la franja se centra en </w:t>
+      </w:r>
+      <w:r>
+        <w:rPr>
+          <w:b/>
+        </w:rPr>
+        <w:t xml:space="preserve">cero</w:t>
+      </w:r>
+      <w:r>
+        <w:t xml:space="preserve"> y no en la intensidad: con 1 mT y una tolerancia del 5 %, un campo residual de hasta ±0,05 mT se considera normal.</w:t>
+      </w:r>
+    </w:p>
+    <w:p>
       <w:pPr>
         <w:pStyle w:val="Heading1"/>
       </w:pPr>
@@ -5666,7 +5852,7 @@
     </w:p>
     <w:p>
       <w:r>
-        <w:t xml:space="preserve">Si el arranque no se confirma, la pantalla de Espera abandona el intento a los pocos segundos y regresa a Principal. </w:t>
+        <w:t xml:space="preserve">Si la placa de control no confirma el arranque, la pantalla de Espera abandona el intento a los pocos segundos y regresa a Principal. </w:t>
       </w:r>
       <w:r>
         <w:rPr>
@@ -5675,7 +5861,329 @@
         <w:t xml:space="preserve">El regreso a Principal significa que el experimento no comenzó</w:t>
       </w:r>
       <w:r>
-        <w:t xml:space="preserve">, no que comenzó y falló.</w:t>
+        <w:t xml:space="preserve">, no que comenzó y falló. Cuando la placa de control </w:t>
+      </w:r>
+      <w:r>
+        <w:rPr>
+          <w:i/>
+        </w:rPr>
+        <w:t xml:space="preserve">sí</w:t>
+      </w:r>
+      <w:r>
+        <w:t xml:space="preserve"> recibió la orden pero se negó a ejecutarla, el motivo se muestra en la pantalla Resultado (ver «Cuando el equipo se niega a iniciar»).</w:t>
+      </w:r>
+    </w:p>
+    <w:p>
+      <w:pPr>
+        <w:pStyle w:val="Heading2"/>
+      </w:pPr>
+      <w:r>
+        <w:t xml:space="preserve">Cómo se mide el campo</w:t>
+      </w:r>
+    </w:p>
+    <w:p>
+      <w:r>
+        <w:t xml:space="preserve">El campo magnético no se lee como una instantánea: la señal de las bobinas es alterna (de 1 a 100 Hz) y una sola lectura depende del punto de la onda en que cae. El equipo toma grupos de 10 muestras repartidas a lo largo de uno o varios períodos (a frecuencias altas el sensor no da para 10 muestras en uno solo), calcula el </w:t>
+      </w:r>
+      <w:r>
+        <w:rPr>
+          <w:b/>
+        </w:rPr>
+        <w:t xml:space="preserve">valor eficaz (RMS)</w:t>
+      </w:r>
+      <w:r>
+        <w:t xml:space="preserve"> de la componente a la frecuencia del experimento y actualiza el valor mostrado </w:t>
+      </w:r>
+      <w:r>
+        <w:rPr>
+          <w:b/>
+        </w:rPr>
+        <w:t xml:space="preserve">cada 2 segundos</w:t>
+      </w:r>
+      <w:r>
+        <w:t xml:space="preserve"> aproximadamente, promediando decenas de grupos. Repartir las muestras así hace que las distorsiones de la señal (armónicos) casi no influyan en el valor; el costo es que el valor tarda esos 2 segundos en aparecer tras el inicio.</w:t>
+      </w:r>
+    </w:p>
+    <w:p>
+      <w:r>
+        <w:t xml:space="preserve">El campo magnético terrestre y cualquier objeto cercano producen una componente </w:t>
+      </w:r>
+      <w:r>
+        <w:rPr>
+          <w:i/>
+        </w:rPr>
+        <w:t xml:space="preserve">continua</w:t>
+      </w:r>
+      <w:r>
+        <w:t xml:space="preserve">, que este cálculo deja fuera por construcción: </w:t>
+      </w:r>
+      <w:r>
+        <w:rPr>
+          <w:b/>
+        </w:rPr>
+        <w:t xml:space="preserve">no hay que medir ni descontar el ambiente antes de empezar</w:t>
+      </w:r>
+      <w:r>
+        <w:t xml:space="preserve">, y el inicio no demora por ese motivo. Lo que sí se suma a la lectura es cualquier fuente </w:t>
+      </w:r>
+      <w:r>
+        <w:rPr>
+          <w:i/>
+        </w:rPr>
+        <w:t xml:space="preserve">alterna</w:t>
+      </w:r>
+      <w:r>
+        <w:t xml:space="preserve"> a la misma frecuencia del experimento (por ejemplo, la red eléctrica si se trabaja a 50 o 60 Hz), por lo que conviene mantener el entorno del magnetómetro libre de equipos encendidos.</w:t>
+      </w:r>
+    </w:p>
+    <w:p>
+      <w:pPr>
+        <w:pStyle w:val="Heading2"/>
+      </w:pPr>
+      <w:r>
+        <w:t xml:space="preserve">Cuando el equipo se niega a iniciar</w:t>
+      </w:r>
+    </w:p>
+    <w:p>
+      <w:r>
+        <w:t xml:space="preserve">Hay situaciones en las que iniciar degradado sería peor que no iniciar. El equipo las trata como un experimento </w:t>
+      </w:r>
+      <w:r>
+        <w:rPr>
+          <w:b/>
+        </w:rPr>
+        <w:t xml:space="preserve">terminado antes de empezar</w:t>
+      </w:r>
+      <w:r>
+        <w:t xml:space="preserve">: muestra la pantalla Resultado con el panel </w:t>
+      </w:r>
+      <w:r>
+        <w:rPr>
+          <w:b/>
+        </w:rPr>
+        <w:t xml:space="preserve">NO INICIÓ</w:t>
+      </w:r>
+      <w:r>
+        <w:t xml:space="preserve">, el motivo y el detalle, y el flujo continúa con normalidad (Volver lleva a Principal).</w:t>
+      </w:r>
+    </w:p>
+    <w:tbl>
+      <w:tblPr>
+        <w:tblW w:w="5000" w:type="pct"/>
+        <w:tblBorders>
+          <w:top w:val="single" w:sz="4" w:color="DFE4EA"/>
+          <w:bottom w:val="single" w:sz="4" w:color="DFE4EA"/>
+          <w:insideH w:val="single" w:sz="4" w:color="DFE4EA"/>
+        </w:tblBorders>
+        <w:tblCellMar>
+          <w:top w:w="60" w:type="dxa"/>
+          <w:bottom w:w="60" w:type="dxa"/>
+        </w:tblCellMar>
+      </w:tblPr>
+      <w:tblGrid>
+        <w:gridCol w:w="2340"/>
+        <w:gridCol w:w="2340"/>
+        <w:gridCol w:w="2340"/>
+        <w:gridCol w:w="2340"/>
+      </w:tblGrid>
+      <w:tr>
+        <w:trPr>
+          <w:tblHeader/>
+        </w:trPr>
+        <w:tc>
+          <w:tcPr>
+            <w:tcW w:w="2340" w:type="dxa"/>
+          </w:tcPr>
+          <w:p>
+            <w:pPr>
+              <w:pStyle w:val="TablaEncabezado"/>
+            </w:pPr>
+            <w:r>
+              <w:t xml:space="preserve">Titular</w:t>
+            </w:r>
+          </w:p>
+        </w:tc>
+        <w:tc>
+          <w:tcPr>
+            <w:tcW w:w="2340" w:type="dxa"/>
+          </w:tcPr>
+          <w:p>
+            <w:pPr>
+              <w:pStyle w:val="TablaEncabezado"/>
+            </w:pPr>
+            <w:r>
+              <w:t xml:space="preserve">Causa</w:t>
+            </w:r>
+          </w:p>
+        </w:tc>
+        <w:tc>
+          <w:tcPr>
+            <w:tcW w:w="2340" w:type="dxa"/>
+          </w:tcPr>
+          <w:p>
+            <w:pPr>
+              <w:pStyle w:val="TablaEncabezado"/>
+            </w:pPr>
+            <w:r>
+              <w:t xml:space="preserve">Qué hacer</w:t>
+            </w:r>
+          </w:p>
+        </w:tc>
+        <w:tc>
+          <w:tcPr>
+            <w:tcW w:w="2340" w:type="dxa"/>
+          </w:tcPr>
+          <w:p>
+            <w:pPr>
+              <w:pStyle w:val="TablaEncabezado"/>
+            </w:pPr>
+            <w:r>
+              <w:t xml:space="preserve">¿Repetir?</w:t>
+            </w:r>
+          </w:p>
+        </w:tc>
+      </w:tr>
+      <w:tr>
+        <w:tc>
+          <w:tcPr>
+            <w:tcW w:w="2340" w:type="dxa"/>
+          </w:tcPr>
+          <w:p>
+            <w:pPr>
+              <w:pStyle w:val="TablaCelda"/>
+            </w:pPr>
+            <w:r>
+              <w:rPr>
+                <w:b/>
+              </w:rPr>
+              <w:t xml:space="preserve">Sin punto en el mapa</w:t>
+            </w:r>
+          </w:p>
+        </w:tc>
+        <w:tc>
+          <w:tcPr>
+            <w:tcW w:w="2340" w:type="dxa"/>
+          </w:tcPr>
+          <w:p>
+            <w:pPr>
+              <w:pStyle w:val="TablaCelda"/>
+            </w:pPr>
+            <w:r>
+              <w:t xml:space="preserve">Campo nulo con una intensidad y frecuencia que el mapa no tiene</w:t>
+            </w:r>
+          </w:p>
+        </w:tc>
+        <w:tc>
+          <w:tcPr>
+            <w:tcW w:w="2340" w:type="dxa"/>
+          </w:tcPr>
+          <w:p>
+            <w:pPr>
+              <w:pStyle w:val="TablaCelda"/>
+            </w:pPr>
+            <w:r>
+              <w:t xml:space="preserve">Medir ese punto en banco y cargarlo en la tarjeta, o elegir otra combinación</w:t>
+            </w:r>
+          </w:p>
+        </w:tc>
+        <w:tc>
+          <w:tcPr>
+            <w:tcW w:w="2340" w:type="dxa"/>
+          </w:tcPr>
+          <w:p>
+            <w:pPr>
+              <w:pStyle w:val="TablaCelda"/>
+            </w:pPr>
+            <w:r>
+              <w:t xml:space="preserve">No</w:t>
+            </w:r>
+          </w:p>
+        </w:tc>
+      </w:tr>
+      <w:tr>
+        <w:tc>
+          <w:tcPr>
+            <w:tcW w:w="2340" w:type="dxa"/>
+          </w:tcPr>
+          <w:p>
+            <w:pPr>
+              <w:pStyle w:val="TablaCelda"/>
+            </w:pPr>
+            <w:r>
+              <w:rPr>
+                <w:b/>
+              </w:rPr>
+              <w:t xml:space="preserve">Balance fuera de tope</w:t>
+            </w:r>
+          </w:p>
+        </w:tc>
+        <w:tc>
+          <w:tcPr>
+            <w:tcW w:w="2340" w:type="dxa"/>
+          </w:tcPr>
+          <w:p>
+            <w:pPr>
+              <w:pStyle w:val="TablaCelda"/>
+            </w:pPr>
+            <w:r>
+              <w:t xml:space="preserve">El balance del punto supera el máximo permitido de la tarjeta</w:t>
+            </w:r>
+          </w:p>
+        </w:tc>
+        <w:tc>
+          <w:tcPr>
+            <w:tcW w:w="2340" w:type="dxa"/>
+          </w:tcPr>
+          <w:p>
+            <w:pPr>
+              <w:pStyle w:val="TablaCelda"/>
+            </w:pPr>
+            <w:r>
+              <w:t xml:space="preserve">Revisar el punto del mapa y el tope</w:t>
+            </w:r>
+          </w:p>
+        </w:tc>
+        <w:tc>
+          <w:tcPr>
+            <w:tcW w:w="2340" w:type="dxa"/>
+          </w:tcPr>
+          <w:p>
+            <w:pPr>
+              <w:pStyle w:val="TablaCelda"/>
+            </w:pPr>
+            <w:r>
+              <w:t xml:space="preserve">No</w:t>
+            </w:r>
+          </w:p>
+        </w:tc>
+      </w:tr>
+    </w:tbl>
+    <w:p>
+      <w:pPr>
+        <w:spacing w:after="0" w:line="120" w:lineRule="exact"/>
+      </w:pPr>
+    </w:p>
+    <w:p>
+      <w:r>
+        <w:t xml:space="preserve">En estos casos el botón </w:t>
+      </w:r>
+      <w:r>
+        <w:rPr>
+          <w:b/>
+        </w:rPr>
+        <w:t xml:space="preserve">Repetir</w:t>
+      </w:r>
+      <w:r>
+        <w:t xml:space="preserve"> no aparece: el problema está en la configuración y repetir fallaría igual hasta cambiarla. Estos rechazos </w:t>
+      </w:r>
+      <w:r>
+        <w:rPr>
+          <w:b/>
+        </w:rPr>
+        <w:t xml:space="preserve">no se publican</w:t>
+      </w:r>
+      <w:r>
+        <w:t xml:space="preserve"> al monitor web: no hubo experimento, y publicarlos crearía una corrida que nunca existió.</w:t>
       </w:r>
     </w:p>
     <w:p>
@@ -6089,7 +6597,7 @@
         <w:t xml:space="preserve">Resultado</w:t>
       </w:r>
       <w:r>
-        <w:t xml:space="preserve"> indica cuál fue:</w:t>
+        <w:t xml:space="preserve"> indica cuál fue. Existe además un cuarto caso, en el que el experimento ni siquiera comenzó:</w:t>
       </w:r>
     </w:p>
     <w:tbl>
@@ -6233,6 +6741,37 @@
           </w:p>
         </w:tc>
       </w:tr>
+      <w:tr>
+        <w:tc>
+          <w:tcPr>
+            <w:tcW w:w="4680" w:type="dxa"/>
+          </w:tcPr>
+          <w:p>
+            <w:pPr>
+              <w:pStyle w:val="TablaCelda"/>
+            </w:pPr>
+            <w:r>
+              <w:rPr>
+                <w:b/>
+              </w:rPr>
+              <w:t xml:space="preserve">No inició</w:t>
+            </w:r>
+          </w:p>
+        </w:tc>
+        <w:tc>
+          <w:tcPr>
+            <w:tcW w:w="4680" w:type="dxa"/>
+          </w:tcPr>
+          <w:p>
+            <w:pPr>
+              <w:pStyle w:val="TablaCelda"/>
+            </w:pPr>
+            <w:r>
+              <w:t xml:space="preserve">El equipo se negó a arrancar (mapa o balance; sección 8). No hubo exposición: progreso y tiempo figuran en cero.</w:t>
+            </w:r>
+          </w:p>
+        </w:tc>
+      </w:tr>
     </w:tbl>
     <w:p>
       <w:pPr>
@@ -6943,6 +7482,75 @@
       </w:r>
       <w:r>
         <w:t xml:space="preserve"> Modificar el archivo con el equipo en marcha no tiene efecto: es necesario reiniciar la interfaz.</w:t>
+      </w:r>
+    </w:p>
+    <w:p>
+      <w:pPr>
+        <w:pStyle w:val="Heading2"/>
+      </w:pPr>
+      <w:r>
+        <w:t xml:space="preserve">Generador de configuración</w:t>
+      </w:r>
+    </w:p>
+    <w:p>
+      <w:r>
+        <w:t xml:space="preserve">El archivo se produce con el </w:t>
+      </w:r>
+      <w:r>
+        <w:rPr>
+          <w:b/>
+        </w:rPr>
+        <w:t xml:space="preserve">generador de configuración</w:t>
+      </w:r>
+      <w:r>
+        <w:t xml:space="preserve"> (</w:t>
+      </w:r>
+      <w:r>
+        <w:rPr>
+          <w:rFonts w:ascii="Consolas" w:hAnsi="Consolas"/>
+          <w:sz w:val="19"/>
+        </w:rPr>
+        <w:t xml:space="preserve">tools/generador-config.html</w:t>
+      </w:r>
+      <w:r>
+        <w:t xml:space="preserve">), una página que acompaña al equipo y sirve para </w:t>
+      </w:r>
+      <w:r>
+        <w:rPr>
+          <w:b/>
+        </w:rPr>
+        <w:t xml:space="preserve">armar el </w:t>
+      </w:r>
+      <w:r>
+        <w:rPr>
+          <w:b/>
+          <w:rFonts w:ascii="Consolas" w:hAnsi="Consolas"/>
+          <w:sz w:val="19"/>
+        </w:rPr>
+        <w:t xml:space="preserve">config.json</w:t>
+      </w:r>
+      <w:r>
+        <w:rPr>
+          <w:b/>
+        </w:rPr>
+        <w:t xml:space="preserve"> sin escribirlo a mano</w:t>
+      </w:r>
+      <w:r>
+        <w:t xml:space="preserve">. Presenta un formulario con todas las secciones del archivo —tipo de corrida, opciones de las listas de Configuración, intervalos, control y mapa de intensidad, bobinas, detector, canales de corriente, telemetría, WiFi y broker— y entrega el archivo listo para copiar en la tarjeta. También permite abrir uno existente para modificarlo. Es el mismo formulario que usa la pantalla «Configuración» del monitor remoto (sección 13).</w:t>
+      </w:r>
+    </w:p>
+    <w:p>
+      <w:r>
+        <w:t xml:space="preserve">Su ventaja es que </w:t>
+      </w:r>
+      <w:r>
+        <w:rPr>
+          <w:b/>
+        </w:rPr>
+        <w:t xml:space="preserve">valida antes de permitir guardar</w:t>
+      </w:r>
+      <w:r>
+        <w:t xml:space="preserve">: rangos, coherencia entre secciones y errores de formato que el equipo no puede advertir por sí mismo. Un valor entero escrito con parte decimal, por ejemplo, se descarta en silencio al leerlo y, en las listas de la pantalla, queda en cero. El generador bloquea la descarga mientras haya errores. Se abre con doble clic, funciona sin conexión y no requiere instalar nada.</w:t>
       </w:r>
     </w:p>
     <w:p>
@@ -7519,6 +8127,141 @@
     </w:p>
     <w:p>
       <w:pPr>
+        <w:pStyle w:val="Heading2"/>
+      </w:pPr>
+      <w:r>
+        <w:t xml:space="preserve">Mapa de intensidad</w:t>
+      </w:r>
+    </w:p>
+    <w:p>
+      <w:r>
+        <w:t xml:space="preserve">La sección </w:t>
+      </w:r>
+      <w:r>
+        <w:rPr>
+          <w:rFonts w:ascii="Consolas" w:hAnsi="Consolas"/>
+          <w:sz w:val="19"/>
+        </w:rPr>
+        <w:t xml:space="preserve">control</w:t>
+      </w:r>
+      <w:r>
+        <w:t xml:space="preserve"> del archivo incluye el mapa, que gobierna cómo se excita la bobina:</w:t>
+      </w:r>
+    </w:p>
+    <w:p>
+      <w:pPr>
+        <w:pStyle w:val="Vinieta"/>
+      </w:pPr>
+      <w:r>
+        <w:rPr>
+          <w:b/>
+        </w:rPr>
+        <w:t xml:space="preserve">El mapa</w:t>
+      </w:r>
+      <w:r>
+        <w:t xml:space="preserve"> (</w:t>
+      </w:r>
+      <w:r>
+        <w:rPr>
+          <w:rFonts w:ascii="Consolas" w:hAnsi="Consolas"/>
+          <w:sz w:val="19"/>
+        </w:rPr>
+        <w:t xml:space="preserve">control.map</w:t>
+      </w:r>
+      <w:r>
+        <w:t xml:space="preserve">). Para cada combinación de intensidad y frecuencia, el ciclo de trabajo que se midió en el banco para lograrla y el </w:t>
+      </w:r>
+      <w:r>
+        <w:rPr>
+          <w:i/>
+        </w:rPr>
+        <w:t xml:space="preserve">balance</w:t>
+      </w:r>
+      <w:r>
+        <w:t xml:space="preserve"> entre los dos grupos de bobinas. Admite hasta </w:t>
+      </w:r>
+      <w:r>
+        <w:rPr>
+          <w:b/>
+        </w:rPr>
+        <w:t xml:space="preserve">3 intensidades por 3 frecuencias</w:t>
+      </w:r>
+      <w:r>
+        <w:t xml:space="preserve">, es decir, 9 puntos como máximo; cada punto se identifica por el </w:t>
+      </w:r>
+      <w:r>
+        <w:rPr>
+          <w:i/>
+        </w:rPr>
+        <w:t xml:space="preserve">valor</w:t>
+      </w:r>
+      <w:r>
+        <w:t xml:space="preserve"> de la intensidad y de la frecuencia, no por su posición en la lista, de modo que reordenar o cambiar las opciones de la pantalla no lo desplaza. En campo X el punto es solo el valor de partida del regulador; en campo nulo es lo que se aplica (sección 7). El tope de balance (</w:t>
+      </w:r>
+      <w:r>
+        <w:rPr>
+          <w:rFonts w:ascii="Consolas" w:hAnsi="Consolas"/>
+          <w:sz w:val="19"/>
+        </w:rPr>
+        <w:t xml:space="preserve">balanceMax</w:t>
+      </w:r>
+      <w:r>
+        <w:t xml:space="preserve">, 0,2 de fábrica) no puede superar 0,5.</w:t>
+      </w:r>
+    </w:p>
+    <w:p>
+      <w:r>
+        <w:t xml:space="preserve">Una tarjeta </w:t>
+      </w:r>
+      <w:r>
+        <w:rPr>
+          <w:b/>
+        </w:rPr>
+        <w:t xml:space="preserve">sin mapa</w:t>
+      </w:r>
+      <w:r>
+        <w:t xml:space="preserve"> vacía el mapa que la placa de control tuviera de una conexión anterior: el campo nulo no corre con puntos que la tarjeta actual no declara. El generador de configuración valida el mapa antes de permitir guardar.</w:t>
+      </w:r>
+    </w:p>
+    <w:p>
+      <w:pPr>
+        <w:pStyle w:val="Etiqueta"/>
+        <w:pBdr>
+          <w:left w:val="single" w:sz="18" w:space="8" w:color="6D4100"/>
+        </w:pBdr>
+        <w:shd w:val="clear" w:fill="FBF4E6"/>
+        <w:ind w:left="200" w:right="120"/>
+        <w:spacing w:before="180" w:after="40"/>
+      </w:pPr>
+      <w:r>
+        <w:t xml:space="preserve">Valores sin verificar</w:t>
+      </w:r>
+    </w:p>
+    <w:p>
+      <w:pPr>
+        <w:pStyle w:val="Llamada"/>
+        <w:pBdr>
+          <w:left w:val="single" w:sz="18" w:space="8" w:color="6D4100"/>
+        </w:pBdr>
+        <w:shd w:val="clear" w:fill="FBF4E6"/>
+        <w:ind w:left="200" w:right="120"/>
+      </w:pPr>
+      <w:r>
+        <w:t xml:space="preserve">Los puntos del mapa y su balance deben obtenerse con el procedimiento de </w:t>
+      </w:r>
+      <w:r>
+        <w:rPr>
+          <w:rFonts w:ascii="Consolas" w:hAnsi="Consolas"/>
+          <w:sz w:val="19"/>
+        </w:rPr>
+        <w:t xml:space="preserve">docs/protocolo-calibracion-intensidad.md</w:t>
+      </w:r>
+      <w:r>
+        <w:t xml:space="preserve">; hasta entonces el campo nulo no puede usarse.</w:t>
+      </w:r>
+    </w:p>
+    <w:p>
+      <w:pPr>
         <w:pStyle w:val="Etiqueta"/>
         <w:pBdr>
           <w:left w:val="single" w:sz="18" w:space="8" w:color="0B4A50"/>
@@ -7541,26 +8284,7 @@
         <w:ind w:left="200" w:right="120"/>
       </w:pPr>
       <w:r>
-        <w:t xml:space="preserve">Se recomienda emplear el generador de configuración que acompaña al equipo (</w:t>
-      </w:r>
-      <w:r>
-        <w:rPr>
-          <w:rFonts w:ascii="Consolas" w:hAnsi="Consolas"/>
-          <w:sz w:val="19"/>
-        </w:rPr>
-        <w:t xml:space="preserve">tools/generador-config.html</w:t>
-      </w:r>
-      <w:r>
-        <w:t xml:space="preserve">): se abre con doble clic, no requiere instalación y </w:t>
-      </w:r>
-      <w:r>
-        <w:rPr>
-          <w:b/>
-        </w:rPr>
-        <w:t xml:space="preserve">valida antes de permitir guardar</w:t>
-      </w:r>
-      <w:r>
-        <w:t xml:space="preserve">. Resulta conveniente incluso para quien domina el formato JSON, porque existen errores que el equipo no puede advertir: un valor entero escrito con parte decimal, por ejemplo, se descarta en silencio y, en las listas de la pantalla, queda en cero.</w:t>
+        <w:t xml:space="preserve">Se recomienda no editar el archivo a mano y usar el generador de configuración (ver arriba), incluso para quien domina el formato JSON.</w:t>
       </w:r>
     </w:p>
     <w:p>
@@ -7662,6 +8386,48 @@
         <w:rPr>
           <w:b/>
         </w:rPr>
+        <w:t xml:space="preserve">El mapa y el balance no están medidos en banco.</w:t>
+      </w:r>
+      <w:r>
+        <w:t xml:space="preserve"> El campo nulo se excita con un ciclo de trabajo que sale del mapa de la tarjeta; sin los puntos medidos, el equipo se niega a iniciar en ese modo. Cuando existan, el balance se fija una vez y no se ajusta durante la exposición: si el desequilibrio entre grupos de bobinas cambia con el calentamiento, el equipo no lo corrige.</w:t>
+      </w:r>
+    </w:p>
+    <w:p>
+      <w:pPr>
+        <w:pStyle w:val="Vinieta"/>
+      </w:pPr>
+      <w:r>
+        <w:rPr>
+          <w:b/>
+        </w:rPr>
+        <w:t xml:space="preserve">La medición del campo no está verificada en banco.</w:t>
+      </w:r>
+      <w:r>
+        <w:t xml:space="preserve"> El valor eficaz tiene un piso de ruido (no lee cero ni con las bobinas apagadas), la atenuación del sensor a 100 Hz no está medida, y una fuente alterna a la frecuencia del experimento (la red a 50 o 60 Hz) se suma a la lectura. Además el magnetómetro no informa el signo del campo, de modo que no puede distinguirse de qué lado se desvía.</w:t>
+      </w:r>
+    </w:p>
+    <w:p>
+      <w:pPr>
+        <w:pStyle w:val="Vinieta"/>
+      </w:pPr>
+      <w:r>
+        <w:rPr>
+          <w:b/>
+        </w:rPr>
+        <w:t xml:space="preserve">Las listas de intensidad y frecuencia admiten 3 entradas cada una</w:t>
+      </w:r>
+      <w:r>
+        <w:t xml:space="preserve"> a efectos del mapa (9 puntos). Más opciones en la tarjeta no tendrían punto asociado.</w:t>
+      </w:r>
+    </w:p>
+    <w:p>
+      <w:pPr>
+        <w:pStyle w:val="Vinieta"/>
+      </w:pPr>
+      <w:r>
+        <w:rPr>
+          <w:b/>
+        </w:rPr>
         <w:t xml:space="preserve">La inversión de fase depende de hardware no montado.</w:t>
       </w:r>
       <w:r>
@@ -7746,7 +8512,7 @@
         <w:rPr>
           <w:b/>
         </w:rPr>
-        <w:t xml:space="preserve">El firmware de la interfaz incluye un modo de banco</w:t>
+        <w:t xml:space="preserve">La tarjeta puede desactivar la exigencia de la placa de control</w:t>
       </w:r>
       <w:r>
         <w:t xml:space="preserve"> (</w:t>
@@ -7756,10 +8522,24 @@
           <w:rFonts w:ascii="Consolas" w:hAnsi="Consolas"/>
           <w:sz w:val="19"/>
         </w:rPr>
-        <w:t xml:space="preserve">BENCH_SIN_MEGA</w:t>
-      </w:r>
-      <w:r>
-        <w:t xml:space="preserve">) que permite alcanzar Principal sin placa de control conectada. Debe estar desactivado en la compilación de producción; de lo contrario, Iniciar permanecería en Espera hasta agotar el tiempo sin que exista nada que arrancar.</w:t>
+        <w:t xml:space="preserve">requireMega</w:t>
+      </w:r>
+      <w:r>
+        <w:t xml:space="preserve">, sección 14). Con ella desmarcada y la placa desconectada, la interfaz «corre» experimentos sin energizar nada. De fábrica está activada; antes de un experimento real conviene revisar que la tarjeta no la haya cambiado.</w:t>
+      </w:r>
+    </w:p>
+    <w:p>
+      <w:pPr>
+        <w:pStyle w:val="Vinieta"/>
+      </w:pPr>
+      <w:r>
+        <w:rPr>
+          <w:b/>
+        </w:rPr>
+        <w:t xml:space="preserve">Un cambio remoto de configuración no avisa en pantalla.</w:t>
+      </w:r>
+      <w:r>
+        <w:t xml:space="preserve"> La configuración enviada desde el monitor web se graba en la tarjeta y se aplica al reiniciar; la interfaz no muestra ningún cartel ni ofrece reiniciar. Además, restringir quién puede publicar en el tema de configuración es un paso manual en la consola del servicio de mensajería.</w:t>
       </w:r>
     </w:p>
     <w:p>
@@ -7953,7 +8733,7 @@
               <w:pStyle w:val="TablaCelda"/>
             </w:pPr>
             <w:r>
-              <w:t xml:space="preserve">El experimento no comenzó</w:t>
+              <w:t xml:space="preserve">El experimento no comenzó: la orden no llegó a la placa de control</w:t>
             </w:r>
           </w:p>
         </w:tc>
@@ -7984,7 +8764,20 @@
               <w:rPr>
                 <w:b/>
               </w:rPr>
-              <w:t xml:space="preserve">Una medición indica «Sin datos»</w:t>
+              <w:t xml:space="preserve">Resultado con panel </w:t>
+            </w:r>
+            <w:r>
+              <w:rPr>
+                <w:b/>
+                <w:i/>
+              </w:rPr>
+              <w:t xml:space="preserve">NO INICIÓ</w:t>
+            </w:r>
+            <w:r>
+              <w:rPr>
+                <w:b/>
+              </w:rPr>
+              <w:t xml:space="preserve"> y «Sin punto en el mapa»</w:t>
             </w:r>
           </w:p>
         </w:tc>
@@ -7997,7 +8790,7 @@
               <w:pStyle w:val="TablaCelda"/>
             </w:pPr>
             <w:r>
-              <w:t xml:space="preserve">Ese sensor no reporta</w:t>
+              <w:t xml:space="preserve">Campo nulo con una intensidad o frecuencia que el mapa de la tarjeta no tiene</w:t>
             </w:r>
           </w:p>
         </w:tc>
@@ -8010,7 +8803,7 @@
               <w:pStyle w:val="TablaCelda"/>
             </w:pPr>
             <w:r>
-              <w:t xml:space="preserve">Revisar la conexión (sección 3.5); confirmar que está habilitado en la configuración</w:t>
+              <w:t xml:space="preserve">Cargar el punto medido en el banco, o elegir una combinación mapeada (sección 14)</w:t>
             </w:r>
           </w:p>
         </w:tc>
@@ -8028,7 +8821,20 @@
               <w:rPr>
                 <w:b/>
               </w:rPr>
-              <w:t xml:space="preserve">La temperatura no reporta pese a estar conectada</w:t>
+              <w:t xml:space="preserve">Resultado con panel </w:t>
+            </w:r>
+            <w:r>
+              <w:rPr>
+                <w:b/>
+                <w:i/>
+              </w:rPr>
+              <w:t xml:space="preserve">NO INICIÓ</w:t>
+            </w:r>
+            <w:r>
+              <w:rPr>
+                <w:b/>
+              </w:rPr>
+              <w:t xml:space="preserve"> y «Balance fuera de tope»</w:t>
             </w:r>
           </w:p>
         </w:tc>
@@ -8041,35 +8847,17 @@
               <w:pStyle w:val="TablaCelda"/>
             </w:pPr>
             <w:r>
-              <w:t xml:space="preserve">El código ROM del DS18B20 no coincide con el compilado</w:t>
-            </w:r>
-          </w:p>
-        </w:tc>
-        <w:tc>
-          <w:tcPr>
-            <w:tcW w:w="3120" w:type="dxa"/>
-          </w:tcPr>
-          <w:p>
-            <w:pPr>
-              <w:pStyle w:val="TablaCelda"/>
-            </w:pPr>
-            <w:r>
-              <w:t xml:space="preserve">Si el sensor fue reemplazado, actualizar </w:t>
+              <w:t xml:space="preserve">El balance del punto supera </w:t>
             </w:r>
             <w:r>
               <w:rPr>
                 <w:rFonts w:ascii="Consolas" w:hAnsi="Consolas"/>
                 <w:sz w:val="19"/>
               </w:rPr>
-              <w:t xml:space="preserve">TEMP1_ADDRESS</w:t>
-            </w:r>
-            <w:r>
-              <w:t xml:space="preserve"> en el firmware</w:t>
-            </w:r>
-          </w:p>
-        </w:tc>
-      </w:tr>
-      <w:tr>
+              <w:t xml:space="preserve">balanceMax</w:t>
+            </w:r>
+          </w:p>
+        </w:tc>
         <w:tc>
           <w:tcPr>
             <w:tcW w:w="3120" w:type="dxa"/>
@@ -8079,13 +8867,12 @@
               <w:pStyle w:val="TablaCelda"/>
             </w:pPr>
             <w:r>
-              <w:rPr>
-                <w:b/>
-              </w:rPr>
-              <w:t xml:space="preserve">La consola del Mega indica «Ningún dispositivo respondió» en I2C</w:t>
-            </w:r>
-          </w:p>
-        </w:tc>
+              <w:t xml:space="preserve">Revisar el punto y el tope en la tarjeta</w:t>
+            </w:r>
+          </w:p>
+        </w:tc>
+      </w:tr>
+      <w:tr>
         <w:tc>
           <w:tcPr>
             <w:tcW w:w="3120" w:type="dxa"/>
@@ -8095,7 +8882,10 @@
               <w:pStyle w:val="TablaCelda"/>
             </w:pPr>
             <w:r>
-              <w:t xml:space="preserve">Bus I2C inoperante</w:t>
+              <w:rPr>
+                <w:b/>
+              </w:rPr>
+              <w:t xml:space="preserve">Una medición indica «Sin datos»</w:t>
             </w:r>
           </w:p>
         </w:tc>
@@ -8108,18 +8898,10 @@
               <w:pStyle w:val="TablaCelda"/>
             </w:pPr>
             <w:r>
-              <w:t xml:space="preserve">Revisar SDA/SCL, alimentación de los módulos y </w:t>
-            </w:r>
-            <w:r>
-              <w:rPr>
-                <w:i/>
-              </w:rPr>
-              <w:t xml:space="preserve">pull-ups</w:t>
-            </w:r>
-          </w:p>
-        </w:tc>
-      </w:tr>
-      <w:tr>
+              <w:t xml:space="preserve">Ese sensor no reporta</w:t>
+            </w:r>
+          </w:p>
+        </w:tc>
         <w:tc>
           <w:tcPr>
             <w:tcW w:w="3120" w:type="dxa"/>
@@ -8129,13 +8911,12 @@
               <w:pStyle w:val="TablaCelda"/>
             </w:pPr>
             <w:r>
-              <w:rPr>
-                <w:b/>
-              </w:rPr>
-              <w:t xml:space="preserve">El campo medido queda muy por debajo de la consigna</w:t>
-            </w:r>
-          </w:p>
-        </w:tc>
+              <w:t xml:space="preserve">Revisar la conexión (sección 3.5); confirmar que está habilitado en la configuración</w:t>
+            </w:r>
+          </w:p>
+        </w:tc>
+      </w:tr>
+      <w:tr>
         <w:tc>
           <w:tcPr>
             <w:tcW w:w="3120" w:type="dxa"/>
@@ -8145,7 +8926,10 @@
               <w:pStyle w:val="TablaCelda"/>
             </w:pPr>
             <w:r>
-              <w:t xml:space="preserve">El regulador no alcanza la consigna</w:t>
+              <w:rPr>
+                <w:b/>
+              </w:rPr>
+              <w:t xml:space="preserve">La temperatura no reporta pese a estar conectada</w:t>
             </w:r>
           </w:p>
         </w:tc>
@@ -8158,12 +8942,10 @@
               <w:pStyle w:val="TablaCelda"/>
             </w:pPr>
             <w:r>
-              <w:t xml:space="preserve">Buscar avisos de recorte en la consola: una bobina puede carecer de margen. Requiere revisar el hardware o recalibrar</w:t>
-            </w:r>
-          </w:p>
-        </w:tc>
-      </w:tr>
-      <w:tr>
+              <w:t xml:space="preserve">El código ROM del DS18B20 no coincide con el compilado</w:t>
+            </w:r>
+          </w:p>
+        </w:tc>
         <w:tc>
           <w:tcPr>
             <w:tcW w:w="3120" w:type="dxa"/>
@@ -8173,131 +8955,17 @@
               <w:pStyle w:val="TablaCelda"/>
             </w:pPr>
             <w:r>
-              <w:rPr>
-                <w:b/>
-              </w:rPr>
-              <w:t xml:space="preserve">Corta apenas concluye la ventana de asentamiento</w:t>
-            </w:r>
-          </w:p>
-        </w:tc>
-        <w:tc>
-          <w:tcPr>
-            <w:tcW w:w="3120" w:type="dxa"/>
-          </w:tcPr>
-          <w:p>
-            <w:pPr>
-              <w:pStyle w:val="TablaCelda"/>
-            </w:pPr>
-            <w:r>
-              <w:t xml:space="preserve">Una condición fuera de rango desde el arranque</w:t>
-            </w:r>
-          </w:p>
-        </w:tc>
-        <w:tc>
-          <w:tcPr>
-            <w:tcW w:w="3120" w:type="dxa"/>
-          </w:tcPr>
-          <w:p>
-            <w:pPr>
-              <w:pStyle w:val="TablaCelda"/>
-            </w:pPr>
-            <w:r>
-              <w:t xml:space="preserve">Consultar el detalle en la pantalla Resultado: indica qué sensor fue</w:t>
-            </w:r>
-          </w:p>
-        </w:tc>
-      </w:tr>
-      <w:tr>
-        <w:tc>
-          <w:tcPr>
-            <w:tcW w:w="3120" w:type="dxa"/>
-          </w:tcPr>
-          <w:p>
-            <w:pPr>
-              <w:pStyle w:val="TablaCelda"/>
-            </w:pPr>
-            <w:r>
-              <w:rPr>
-                <w:b/>
-              </w:rPr>
-              <w:t xml:space="preserve">Se modificó el archivo de la SD y no hubo cambios</w:t>
-            </w:r>
-          </w:p>
-        </w:tc>
-        <w:tc>
-          <w:tcPr>
-            <w:tcW w:w="3120" w:type="dxa"/>
-          </w:tcPr>
-          <w:p>
-            <w:pPr>
-              <w:pStyle w:val="TablaCelda"/>
-            </w:pPr>
-            <w:r>
-              <w:t xml:space="preserve">Se lee solo al encender</w:t>
-            </w:r>
-          </w:p>
-        </w:tc>
-        <w:tc>
-          <w:tcPr>
-            <w:tcW w:w="3120" w:type="dxa"/>
-          </w:tcPr>
-          <w:p>
-            <w:pPr>
-              <w:pStyle w:val="TablaCelda"/>
-            </w:pPr>
-            <w:r>
-              <w:t xml:space="preserve">Reiniciar la interfaz</w:t>
-            </w:r>
-          </w:p>
-        </w:tc>
-      </w:tr>
-      <w:tr>
-        <w:tc>
-          <w:tcPr>
-            <w:tcW w:w="3120" w:type="dxa"/>
-          </w:tcPr>
-          <w:p>
-            <w:pPr>
-              <w:pStyle w:val="TablaCelda"/>
-            </w:pPr>
-            <w:r>
-              <w:rPr>
-                <w:b/>
-              </w:rPr>
-              <w:t xml:space="preserve">La interfaz indica «Continuando sin tarjeta SD» con tarjeta insertada</w:t>
-            </w:r>
-          </w:p>
-        </w:tc>
-        <w:tc>
-          <w:tcPr>
-            <w:tcW w:w="3120" w:type="dxa"/>
-          </w:tcPr>
-          <w:p>
-            <w:pPr>
-              <w:pStyle w:val="TablaCelda"/>
-            </w:pPr>
-            <w:r>
-              <w:t xml:space="preserve">La tarjeta no responde en el bus VSPI</w:t>
-            </w:r>
-          </w:p>
-        </w:tc>
-        <w:tc>
-          <w:tcPr>
-            <w:tcW w:w="3120" w:type="dxa"/>
-          </w:tcPr>
-          <w:p>
-            <w:pPr>
-              <w:pStyle w:val="TablaCelda"/>
-            </w:pPr>
-            <w:r>
-              <w:t xml:space="preserve">Reinsertar; comprobar formato FAT32; ensayar con </w:t>
+              <w:t xml:space="preserve">Si el sensor fue reemplazado, actualizar </w:t>
             </w:r>
             <w:r>
               <w:rPr>
                 <w:rFonts w:ascii="Consolas" w:hAnsi="Consolas"/>
                 <w:sz w:val="19"/>
               </w:rPr>
-              <w:t xml:space="preserve">tools/test-sd-esp32</w:t>
+              <w:t xml:space="preserve">TEMP1_ADDRESS</w:t>
+            </w:r>
+            <w:r>
+              <w:t xml:space="preserve"> en el firmware</w:t>
             </w:r>
           </w:p>
         </w:tc>
@@ -8315,7 +8983,7 @@
               <w:rPr>
                 <w:b/>
               </w:rPr>
-              <w:t xml:space="preserve">Se cambió la configuración y el panel remoto dejó de mostrar un valor</w:t>
+              <w:t xml:space="preserve">La consola del Mega indica «Ningún dispositivo respondió» en I2C</w:t>
             </w:r>
           </w:p>
         </w:tc>
@@ -8328,7 +8996,7 @@
               <w:pStyle w:val="TablaCelda"/>
             </w:pPr>
             <w:r>
-              <w:t xml:space="preserve">Se renombró un campo de telemetría</w:t>
+              <w:t xml:space="preserve">Bus I2C inoperante</w:t>
             </w:r>
           </w:p>
         </w:tc>
@@ -8341,7 +9009,13 @@
               <w:pStyle w:val="TablaCelda"/>
             </w:pPr>
             <w:r>
-              <w:t xml:space="preserve">El panel remoto espera los nombres originales: revertirlos o actualizar el panel</w:t>
+              <w:t xml:space="preserve">Revisar SDA/SCL, alimentación de los módulos y </w:t>
+            </w:r>
+            <w:r>
+              <w:rPr>
+                <w:i/>
+              </w:rPr>
+              <w:t xml:space="preserve">pull-ups</w:t>
             </w:r>
           </w:p>
         </w:tc>
@@ -8359,7 +9033,7 @@
               <w:rPr>
                 <w:b/>
               </w:rPr>
-              <w:t xml:space="preserve">Colores invertidos o toque permanente en una esquina</w:t>
+              <w:t xml:space="preserve">El campo medido queda muy por debajo de la consigna</w:t>
             </w:r>
           </w:p>
         </w:tc>
@@ -8372,7 +9046,7 @@
               <w:pStyle w:val="TablaCelda"/>
             </w:pPr>
             <w:r>
-              <w:t xml:space="preserve">Firmware compilado para la otra revisión de la placa HMI</w:t>
+              <w:t xml:space="preserve">El regulador no alcanza la consigna</w:t>
             </w:r>
           </w:p>
         </w:tc>
@@ -8385,23 +9059,250 @@
               <w:pStyle w:val="TablaCelda"/>
             </w:pPr>
             <w:r>
-              <w:t xml:space="preserve">Ajustar </w:t>
+              <w:t xml:space="preserve">Buscar avisos de recorte en la consola: una bobina puede carecer de margen. Requiere revisar el hardware o recalibrar</w:t>
+            </w:r>
+          </w:p>
+        </w:tc>
+      </w:tr>
+      <w:tr>
+        <w:tc>
+          <w:tcPr>
+            <w:tcW w:w="3120" w:type="dxa"/>
+          </w:tcPr>
+          <w:p>
+            <w:pPr>
+              <w:pStyle w:val="TablaCelda"/>
+            </w:pPr>
+            <w:r>
+              <w:rPr>
+                <w:b/>
+              </w:rPr>
+              <w:t xml:space="preserve">Corta apenas concluye la ventana de asentamiento</w:t>
+            </w:r>
+          </w:p>
+        </w:tc>
+        <w:tc>
+          <w:tcPr>
+            <w:tcW w:w="3120" w:type="dxa"/>
+          </w:tcPr>
+          <w:p>
+            <w:pPr>
+              <w:pStyle w:val="TablaCelda"/>
+            </w:pPr>
+            <w:r>
+              <w:t xml:space="preserve">Una condición fuera de rango desde el arranque</w:t>
+            </w:r>
+          </w:p>
+        </w:tc>
+        <w:tc>
+          <w:tcPr>
+            <w:tcW w:w="3120" w:type="dxa"/>
+          </w:tcPr>
+          <w:p>
+            <w:pPr>
+              <w:pStyle w:val="TablaCelda"/>
+            </w:pPr>
+            <w:r>
+              <w:t xml:space="preserve">Consultar el detalle en la pantalla Resultado: indica qué sensor fue</w:t>
+            </w:r>
+          </w:p>
+        </w:tc>
+      </w:tr>
+      <w:tr>
+        <w:tc>
+          <w:tcPr>
+            <w:tcW w:w="3120" w:type="dxa"/>
+          </w:tcPr>
+          <w:p>
+            <w:pPr>
+              <w:pStyle w:val="TablaCelda"/>
+            </w:pPr>
+            <w:r>
+              <w:rPr>
+                <w:b/>
+              </w:rPr>
+              <w:t xml:space="preserve">Se modificó el archivo de la SD y no hubo cambios</w:t>
+            </w:r>
+          </w:p>
+        </w:tc>
+        <w:tc>
+          <w:tcPr>
+            <w:tcW w:w="3120" w:type="dxa"/>
+          </w:tcPr>
+          <w:p>
+            <w:pPr>
+              <w:pStyle w:val="TablaCelda"/>
+            </w:pPr>
+            <w:r>
+              <w:t xml:space="preserve">Se lee solo al encender</w:t>
+            </w:r>
+          </w:p>
+        </w:tc>
+        <w:tc>
+          <w:tcPr>
+            <w:tcW w:w="3120" w:type="dxa"/>
+          </w:tcPr>
+          <w:p>
+            <w:pPr>
+              <w:pStyle w:val="TablaCelda"/>
+            </w:pPr>
+            <w:r>
+              <w:t xml:space="preserve">Reiniciar la interfaz</w:t>
+            </w:r>
+          </w:p>
+        </w:tc>
+      </w:tr>
+      <w:tr>
+        <w:tc>
+          <w:tcPr>
+            <w:tcW w:w="3120" w:type="dxa"/>
+          </w:tcPr>
+          <w:p>
+            <w:pPr>
+              <w:pStyle w:val="TablaCelda"/>
+            </w:pPr>
+            <w:r>
+              <w:rPr>
+                <w:b/>
+              </w:rPr>
+              <w:t xml:space="preserve">La interfaz indica «Continuando sin tarjeta SD» con tarjeta insertada</w:t>
+            </w:r>
+          </w:p>
+        </w:tc>
+        <w:tc>
+          <w:tcPr>
+            <w:tcW w:w="3120" w:type="dxa"/>
+          </w:tcPr>
+          <w:p>
+            <w:pPr>
+              <w:pStyle w:val="TablaCelda"/>
+            </w:pPr>
+            <w:r>
+              <w:t xml:space="preserve">La tarjeta no responde en el bus VSPI</w:t>
+            </w:r>
+          </w:p>
+        </w:tc>
+        <w:tc>
+          <w:tcPr>
+            <w:tcW w:w="3120" w:type="dxa"/>
+          </w:tcPr>
+          <w:p>
+            <w:pPr>
+              <w:pStyle w:val="TablaCelda"/>
+            </w:pPr>
+            <w:r>
+              <w:t xml:space="preserve">Reinsertar; comprobar formato FAT32; ensayar con </w:t>
             </w:r>
             <w:r>
               <w:rPr>
                 <w:rFonts w:ascii="Consolas" w:hAnsi="Consolas"/>
                 <w:sz w:val="19"/>
               </w:rPr>
-              <w:t xml:space="preserve">TOUCH_KIND</w:t>
-            </w:r>
-            <w:r>
-              <w:t xml:space="preserve"> y </w:t>
+              <w:t xml:space="preserve">tools/test-sd-esp32</w:t>
+            </w:r>
+          </w:p>
+        </w:tc>
+      </w:tr>
+      <w:tr>
+        <w:tc>
+          <w:tcPr>
+            <w:tcW w:w="3120" w:type="dxa"/>
+          </w:tcPr>
+          <w:p>
+            <w:pPr>
+              <w:pStyle w:val="TablaCelda"/>
+            </w:pPr>
+            <w:r>
+              <w:rPr>
+                <w:b/>
+              </w:rPr>
+              <w:t xml:space="preserve">Se cambió la configuración y el panel remoto dejó de mostrar un valor</w:t>
+            </w:r>
+          </w:p>
+        </w:tc>
+        <w:tc>
+          <w:tcPr>
+            <w:tcW w:w="3120" w:type="dxa"/>
+          </w:tcPr>
+          <w:p>
+            <w:pPr>
+              <w:pStyle w:val="TablaCelda"/>
+            </w:pPr>
+            <w:r>
+              <w:t xml:space="preserve">Se renombró un campo de telemetría</w:t>
+            </w:r>
+          </w:p>
+        </w:tc>
+        <w:tc>
+          <w:tcPr>
+            <w:tcW w:w="3120" w:type="dxa"/>
+          </w:tcPr>
+          <w:p>
+            <w:pPr>
+              <w:pStyle w:val="TablaCelda"/>
+            </w:pPr>
+            <w:r>
+              <w:t xml:space="preserve">El panel remoto espera los nombres originales: revertirlos o actualizar el panel</w:t>
+            </w:r>
+          </w:p>
+        </w:tc>
+      </w:tr>
+      <w:tr>
+        <w:tc>
+          <w:tcPr>
+            <w:tcW w:w="3120" w:type="dxa"/>
+          </w:tcPr>
+          <w:p>
+            <w:pPr>
+              <w:pStyle w:val="TablaCelda"/>
+            </w:pPr>
+            <w:r>
+              <w:rPr>
+                <w:b/>
+              </w:rPr>
+              <w:t xml:space="preserve">Colores invertidos o toque permanente en una esquina</w:t>
+            </w:r>
+          </w:p>
+        </w:tc>
+        <w:tc>
+          <w:tcPr>
+            <w:tcW w:w="3120" w:type="dxa"/>
+          </w:tcPr>
+          <w:p>
+            <w:pPr>
+              <w:pStyle w:val="TablaCelda"/>
+            </w:pPr>
+            <w:r>
+              <w:t xml:space="preserve">Firmware compilado para la otra revisión de la placa HMI</w:t>
+            </w:r>
+          </w:p>
+        </w:tc>
+        <w:tc>
+          <w:tcPr>
+            <w:tcW w:w="3120" w:type="dxa"/>
+          </w:tcPr>
+          <w:p>
+            <w:pPr>
+              <w:pStyle w:val="TablaCelda"/>
+            </w:pPr>
+            <w:r>
+              <w:t xml:space="preserve">Ajustar </w:t>
             </w:r>
             <w:r>
               <w:rPr>
                 <w:rFonts w:ascii="Consolas" w:hAnsi="Consolas"/>
                 <w:sz w:val="19"/>
               </w:rPr>
+              <w:t xml:space="preserve">TOUCH_KIND</w:t>
+            </w:r>
+            <w:r>
+              <w:t xml:space="preserve"> y </w:t>
+            </w:r>
+            <w:r>
+              <w:rPr>
+                <w:rFonts w:ascii="Consolas" w:hAnsi="Consolas"/>
+                <w:sz w:val="19"/>
+              </w:rPr>
               <w:t xml:space="preserve">TFT_INVERSION_ON</w:t>
             </w:r>
             <w:r>
@@ -8522,6 +9423,34 @@
       </w:r>
       <w:r>
         <w:t xml:space="preserve"> Un control mal cancelado es un grupo tratado sin que nadie lo advierta, y constituye el error más costoso que este equipo puede cometer: invalida la comparación completa sin manifestar síntoma alguno.</w:t>
+      </w:r>
+    </w:p>
+    <w:p>
+      <w:pPr>
+        <w:pStyle w:val="Vinieta"/>
+      </w:pPr>
+      <w:r>
+        <w:rPr>
+          <w:b/>
+        </w:rPr>
+        <w:t xml:space="preserve">No tocar nada cerca del magnetómetro al pulsar Iniciar.</w:t>
+      </w:r>
+      <w:r>
+        <w:t xml:space="preserve"> Durante los primeros segundos el equipo mide el campo ambiente para descontarlo; lo que se mueva en ese lapso queda incorporado como si fuera ambiente.</w:t>
+      </w:r>
+    </w:p>
+    <w:p>
+      <w:pPr>
+        <w:pStyle w:val="Vinieta"/>
+      </w:pPr>
+      <w:r>
+        <w:rPr>
+          <w:b/>
+        </w:rPr>
+        <w:t xml:space="preserve">No dar por válido el campo nulo sin el mapa medido.</w:t>
+      </w:r>
+      <w:r>
+        <w:t xml:space="preserve"> Cargar el punto de cada combinación de intensidad y frecuencia que se vaya a usar, y verificar el campo residual con el magnetómetro antes de la serie.</w:t>
       </w:r>
     </w:p>
     <w:p>

</xml_diff>

<commit_message>
Fija el rele general y los enables de bobina como activos en alto
HIGH energiza; LOW, pin al aire o Mega sin alimentacion dejan el rele
abierto y las bobinas cortadas, con pull-down en la entrada de cada
driver. mainRelay pasa de ACTIVE_LOW a ACTIVE_HIGH: un Mega apagado con
la etapa alimentada cerraba un rele activo en bajo. La polaridad queda
fija en firmware y especificada para el hardware, no configurable por SD.
Se documenta en coil-excitation.md, el manual y el checklist de puesta
en marcha (todos los enables en 0 V en una corrida sintetica).

Tambien renombra la traza del lazo [TESTMODE][PWM] -> [CONTROL][PWM],
herencia del testMode eliminado.

Co-Authored-By: Claude Opus 5.5 <noreply@anthropic.com>
</commit_message>
<xml_diff>
--- a/docs/manual-de-usuario.docx
+++ b/docs/manual-de-usuario.docx
@@ -974,10 +974,19 @@
               <w:rPr>
                 <w:b/>
               </w:rPr>
-              <w:t xml:space="preserve">Activo en bajo</w:t>
-            </w:r>
-            <w:r>
-              <w:t xml:space="preserve">: nivel LOW = relé cerrado = etapa de potencia habilitada. Al arrancar queda en HIGH (abierto).</w:t>
+              <w:t xml:space="preserve">Activo en alto</w:t>
+            </w:r>
+            <w:r>
+              <w:t xml:space="preserve">: HIGH = relé cerrado = etapa de potencia habilitada. LOW, pin desconectado o placa sin alimentación = relé abierto. El driver del relé lleva </w:t>
+            </w:r>
+            <w:r>
+              <w:rPr>
+                <w:i/>
+              </w:rPr>
+              <w:t xml:space="preserve">pull-down</w:t>
+            </w:r>
+            <w:r>
+              <w:t xml:space="preserve"> en su entrada. Al arrancar queda en LOW (abierto).</w:t>
             </w:r>
           </w:p>
         </w:tc>
@@ -1505,7 +1514,16 @@
               <w:pStyle w:val="TablaCelda"/>
             </w:pPr>
             <w:r>
-              <w:t xml:space="preserve">Activo en alto. Entrada digital a la etapa de estado sólido.</w:t>
+              <w:t xml:space="preserve">Activo en alto: HIGH = bobina habilitada; LOW o desconectado = cortada. Entrada digital a la etapa de estado sólido, con </w:t>
+            </w:r>
+            <w:r>
+              <w:rPr>
+                <w:i/>
+              </w:rPr>
+              <w:t xml:space="preserve">pull-down</w:t>
+            </w:r>
+            <w:r>
+              <w:t xml:space="preserve"> del lado de la etapa.</w:t>
             </w:r>
           </w:p>
         </w:tc>

</xml_diff>